<commit_message>
docs: agregar correos institucionales en 01 y 02
</commit_message>
<xml_diff>
--- a/fase 2/EVIDENCIAS PROYECTO/Evidencias de documentación/01 Documento de Visión y Roles Scrum.docx
+++ b/fase 2/EVIDENCIAS PROYECTO/Evidencias de documentación/01 Documento de Visión y Roles Scrum.docx
@@ -612,7 +612,7 @@
           <w:r>
             <w:fldChar w:fldCharType="separate"/>
           </w:r>
-          <w:hyperlink w:anchor="_Toc242871317" w:history="1">
+          <w:hyperlink w:anchor="_Toc242875540" w:history="1">
             <w:r>
               <w:rPr>
                 <w:rStyle w:val="Hipervnculo"/>
@@ -640,7 +640,7 @@
                 <w:noProof/>
                 <w:webHidden/>
               </w:rPr>
-              <w:instrText xml:space="preserve"> PAGEREF _Toc242871317 \h </w:instrText>
+              <w:instrText xml:space="preserve"> PAGEREF _Toc242875540 \h </w:instrText>
             </w:r>
             <w:r>
               <w:rPr>
@@ -687,7 +687,7 @@
               <w14:ligatures w14:val="standardContextual"/>
             </w:rPr>
           </w:pPr>
-          <w:hyperlink w:anchor="_Toc242871318" w:history="1">
+          <w:hyperlink w:anchor="_Toc242875541" w:history="1">
             <w:r>
               <w:rPr>
                 <w:rStyle w:val="Hipervnculo"/>
@@ -715,7 +715,7 @@
                 <w:noProof/>
                 <w:webHidden/>
               </w:rPr>
-              <w:instrText xml:space="preserve"> PAGEREF _Toc242871318 \h </w:instrText>
+              <w:instrText xml:space="preserve"> PAGEREF _Toc242875541 \h </w:instrText>
             </w:r>
             <w:r>
               <w:rPr>
@@ -762,7 +762,7 @@
               <w14:ligatures w14:val="standardContextual"/>
             </w:rPr>
           </w:pPr>
-          <w:hyperlink w:anchor="_Toc242871319" w:history="1">
+          <w:hyperlink w:anchor="_Toc242875542" w:history="1">
             <w:r>
               <w:rPr>
                 <w:rStyle w:val="Hipervnculo"/>
@@ -790,7 +790,7 @@
                 <w:noProof/>
                 <w:webHidden/>
               </w:rPr>
-              <w:instrText xml:space="preserve"> PAGEREF _Toc242871319 \h </w:instrText>
+              <w:instrText xml:space="preserve"> PAGEREF _Toc242875542 \h </w:instrText>
             </w:r>
             <w:r>
               <w:rPr>
@@ -858,7 +858,7 @@
           <w:rFonts w:eastAsia="Times New Roman"/>
         </w:rPr>
       </w:pPr>
-      <w:bookmarkStart w:id="1" w:name="_Toc242871317"/>
+      <w:bookmarkStart w:id="1" w:name="_Toc242875540"/>
       <w:r>
         <w:rPr>
           <w:rFonts w:eastAsia="Times New Roman"/>
@@ -1739,9 +1739,9 @@
         <w:tblLook w:val="04A0" w:firstRow="1" w:lastRow="0" w:firstColumn="1" w:lastColumn="0" w:noHBand="0" w:noVBand="1"/>
       </w:tblPr>
       <w:tblGrid>
-        <w:gridCol w:w="2101"/>
-        <w:gridCol w:w="3439"/>
-        <w:gridCol w:w="3180"/>
+        <w:gridCol w:w="2093"/>
+        <w:gridCol w:w="3417"/>
+        <w:gridCol w:w="3210"/>
       </w:tblGrid>
       <w:tr>
         <w:trPr>
@@ -1902,7 +1902,7 @@
                 <w:color w:val="000000"/>
                 <w:sz w:val="20"/>
               </w:rPr>
-              <w:t>[correo por confirmar]</w:t>
+              <w:t>Jor.ceballos@duocuc.cl</w:t>
             </w:r>
           </w:p>
         </w:tc>
@@ -1982,7 +1982,7 @@
                 <w:color w:val="000000"/>
                 <w:sz w:val="20"/>
               </w:rPr>
-              <w:t>[correo por confirmar]</w:t>
+              <w:t>Ju.marinan@duocuc.cl</w:t>
             </w:r>
           </w:p>
         </w:tc>
@@ -2062,7 +2062,7 @@
                 <w:color w:val="000000"/>
                 <w:sz w:val="20"/>
               </w:rPr>
-              <w:t>[correo por confirmar]</w:t>
+              <w:t>Ala.bravo@duocuc.cl</w:t>
             </w:r>
           </w:p>
         </w:tc>
@@ -2220,7 +2220,7 @@
           <w:rFonts w:eastAsia="Times New Roman"/>
         </w:rPr>
       </w:pPr>
-      <w:bookmarkStart w:id="4" w:name="_Toc242871318"/>
+      <w:bookmarkStart w:id="4" w:name="_Toc242875541"/>
       <w:r>
         <w:rPr>
           <w:rFonts w:eastAsia="Times New Roman"/>
@@ -2678,7 +2678,7 @@
                 <w:szCs w:val="24"/>
               </w:rPr>
               <w:drawing>
-                <wp:inline distT="0" distB="0" distL="0" distR="0" wp14:anchorId="6E922985" wp14:editId="6B95415F">
+                <wp:inline distT="0" distB="0" distL="0" distR="0" wp14:anchorId="6E922985" wp14:editId="232B2B66">
                   <wp:extent cx="701944" cy="525780"/>
                   <wp:effectExtent l="0" t="0" r="3175" b="7620"/>
                   <wp:docPr id="1026" name="Picture 2" descr="Resultado de imagen para software">
@@ -3622,7 +3622,7 @@
           <w:rFonts w:eastAsia="Times New Roman"/>
         </w:rPr>
       </w:pPr>
-      <w:bookmarkStart w:id="5" w:name="_Toc242871319"/>
+      <w:bookmarkStart w:id="5" w:name="_Toc242875542"/>
       <w:r>
         <w:rPr>
           <w:rFonts w:eastAsia="Times New Roman"/>

</xml_diff>